<commit_message>
docs: add admin console GUI section (audit log viewer + user/role management) to auth spec
</commit_message>
<xml_diff>
--- a/docs/Auth_RBAC_Audit_Design_Spec.docx
+++ b/docs/Auth_RBAC_Audit_Design_Spec.docx
@@ -1062,7 +1062,7 @@
         <w:spacing w:after="160" w:before="320"/>
       </w:pPr>
       <w:r>
-        <w:t xml:space="preserve">7. Data Model Impact</w:t>
+        <w:t xml:space="preserve">7. Admin Console GUI</w:t>
       </w:r>
     </w:p>
     <w:p>
@@ -1070,46 +1070,510 @@
         <w:spacing w:after="120"/>
       </w:pPr>
       <w:r>
-        <w:t xml:space="preserve">New tables required — there are no user, session, or audit tables in the schema today:</w:t>
-      </w:r>
-    </w:p>
-    <w:p>
-      <w:pPr>
-        <w:pStyle w:val="ListParagraph"/>
-        <w:numPr>
-          <w:ilvl w:val="0"/>
-          <w:numId w:val="1"/>
-        </w:numPr>
-        <w:spacing w:after="80"/>
-      </w:pPr>
-      <w:r>
-        <w:t xml:space="preserve">users — id, email, display_name, role, auth_provider (local | sso), password_hash (nullable), sso_subject_id (nullable), is_active, created_at, last_login_at.</w:t>
-      </w:r>
-    </w:p>
-    <w:p>
-      <w:pPr>
-        <w:pStyle w:val="ListParagraph"/>
-        <w:numPr>
-          <w:ilvl w:val="0"/>
-          <w:numId w:val="1"/>
-        </w:numPr>
-        <w:spacing w:after="80"/>
-      </w:pPr>
-      <w:r>
-        <w:t xml:space="preserve">audit_log — as described in 6.2, indexed by timestamp and actor_user_id.</w:t>
-      </w:r>
-    </w:p>
-    <w:p>
-      <w:pPr>
-        <w:pStyle w:val="ListParagraph"/>
-        <w:numPr>
-          <w:ilvl w:val="0"/>
-          <w:numId w:val="1"/>
-        </w:numPr>
-        <w:spacing w:after="80"/>
-      </w:pPr>
-      <w:r>
-        <w:t xml:space="preserve">Sessions are managed by the auth library's own store (e.g. NextAuth's session table/JWT), not a new bespoke table.</w:t>
+        <w:t xml:space="preserve">Both the audit log and user/role management need a real interface, not just database tables — this section specifies that GUI. It is placed as its own top-level admin section (e.g. an /admin route), separate from the RFQ workspace nav, since the audience is different: people administering the tool vs. people working RFQs.</w:t>
+      </w:r>
+    </w:p>
+    <w:p>
+      <w:pPr>
+        <w:pStyle w:val="Heading2"/>
+        <w:spacing w:after="120" w:before="240"/>
+      </w:pPr>
+      <w:r>
+        <w:t xml:space="preserve">7.1 Access</w:t>
+      </w:r>
+    </w:p>
+    <w:p>
+      <w:pPr>
+        <w:pStyle w:val="ListParagraph"/>
+        <w:numPr>
+          <w:ilvl w:val="0"/>
+          <w:numId w:val="1"/>
+        </w:numPr>
+        <w:spacing w:after="80"/>
+      </w:pPr>
+      <w:r>
+        <w:t xml:space="preserve">Visible only to the admin role; a non-admin user hitting the route directly is redirected/denied, and that denial is itself logged as an authorization event (Section 6.1).</w:t>
+      </w:r>
+    </w:p>
+    <w:p>
+      <w:pPr>
+        <w:pStyle w:val="ListParagraph"/>
+        <w:numPr>
+          <w:ilvl w:val="0"/>
+          <w:numId w:val="1"/>
+        </w:numPr>
+        <w:spacing w:after="80"/>
+      </w:pPr>
+      <w:r>
+        <w:t xml:space="preserve">Built from the existing shadcn-style primitives already in src/components/ui/ (Card, Table, Badge, Button) — no new design language introduced for just this screen.</w:t>
+      </w:r>
+    </w:p>
+    <w:p>
+      <w:pPr>
+        <w:pStyle w:val="Heading2"/>
+        <w:spacing w:after="120" w:before="240"/>
+      </w:pPr>
+      <w:r>
+        <w:t xml:space="preserve">7.2 Audit Log Viewer</w:t>
+      </w:r>
+    </w:p>
+    <w:tbl>
+      <w:tblPr>
+        <w:tblW w:type="dxa" w:w="10000"/>
+        <w:tblBorders>
+          <w:top w:val="single" w:color="auto" w:sz="4"/>
+          <w:left w:val="single" w:color="auto" w:sz="4"/>
+          <w:bottom w:val="single" w:color="auto" w:sz="4"/>
+          <w:right w:val="single" w:color="auto" w:sz="4"/>
+          <w:insideH w:val="single" w:color="auto" w:sz="4"/>
+          <w:insideV w:val="single" w:color="auto" w:sz="4"/>
+        </w:tblBorders>
+      </w:tblPr>
+      <w:tblGrid>
+        <w:gridCol w:w="2200"/>
+        <w:gridCol w:w="7800"/>
+      </w:tblGrid>
+      <w:tr>
+        <w:trPr>
+          <w:tblHeader/>
+        </w:trPr>
+        <w:tc>
+          <w:tcPr>
+            <w:tcW w:type="dxa" w:w="2200"/>
+            <w:shd w:fill="1A2332" w:val="clear"/>
+          </w:tcPr>
+          <w:p>
+            <w:r>
+              <w:rPr>
+                <w:b/>
+                <w:bCs/>
+                <w:color w:val="FFFFFF"/>
+              </w:rPr>
+              <w:t xml:space="preserve">Element</w:t>
+            </w:r>
+          </w:p>
+        </w:tc>
+        <w:tc>
+          <w:tcPr>
+            <w:tcW w:type="dxa" w:w="7800"/>
+            <w:shd w:fill="1A2332" w:val="clear"/>
+          </w:tcPr>
+          <w:p>
+            <w:r>
+              <w:rPr>
+                <w:b/>
+                <w:bCs/>
+                <w:color w:val="FFFFFF"/>
+              </w:rPr>
+              <w:t xml:space="preserve">Behavior</w:t>
+            </w:r>
+          </w:p>
+        </w:tc>
+      </w:tr>
+      <w:tr>
+        <w:tc>
+          <w:tcPr>
+            <w:tcW w:type="dxa" w:w="2200"/>
+          </w:tcPr>
+          <w:p>
+            <w:r>
+              <w:rPr>
+                <w:rFonts w:ascii="Consolas" w:cs="Consolas" w:eastAsia="Consolas" w:hAnsi="Consolas"/>
+              </w:rPr>
+              <w:t xml:space="preserve">Table columns</w:t>
+            </w:r>
+          </w:p>
+        </w:tc>
+        <w:tc>
+          <w:tcPr>
+            <w:tcW w:type="dxa" w:w="7800"/>
+          </w:tcPr>
+          <w:p>
+            <w:r>
+              <w:t xml:space="preserve">Timestamp, Actor, Action, Resource, Result, IP Address — backed by the Table/TableHeader/TableRow primitives already used in RFQAgentDashboard.tsx.</w:t>
+            </w:r>
+          </w:p>
+        </w:tc>
+      </w:tr>
+      <w:tr>
+        <w:tc>
+          <w:tcPr>
+            <w:tcW w:type="dxa" w:w="2200"/>
+          </w:tcPr>
+          <w:p>
+            <w:r>
+              <w:rPr>
+                <w:rFonts w:ascii="Consolas" w:cs="Consolas" w:eastAsia="Consolas" w:hAnsi="Consolas"/>
+              </w:rPr>
+              <w:t xml:space="preserve">Filters</w:t>
+            </w:r>
+          </w:p>
+        </w:tc>
+        <w:tc>
+          <w:tcPr>
+            <w:tcW w:type="dxa" w:w="7800"/>
+          </w:tcPr>
+          <w:p>
+            <w:r>
+              <w:t xml:space="preserve">Date range, actor (user picker), action category (auth / authorization / account admin / data change), resource type, and result (success/failure).</w:t>
+            </w:r>
+          </w:p>
+        </w:tc>
+      </w:tr>
+      <w:tr>
+        <w:tc>
+          <w:tcPr>
+            <w:tcW w:type="dxa" w:w="2200"/>
+          </w:tcPr>
+          <w:p>
+            <w:r>
+              <w:rPr>
+                <w:rFonts w:ascii="Consolas" w:cs="Consolas" w:eastAsia="Consolas" w:hAnsi="Consolas"/>
+              </w:rPr>
+              <w:t xml:space="preserve">Row detail</w:t>
+            </w:r>
+          </w:p>
+        </w:tc>
+        <w:tc>
+          <w:tcPr>
+            <w:tcW w:type="dxa" w:w="7800"/>
+          </w:tcPr>
+          <w:p>
+            <w:r>
+              <w:t xml:space="preserve">Expanding a row (or opening a side drawer) shows the full details_json payload for that event — e.g. the old/new values on a gap-finding override.</w:t>
+            </w:r>
+          </w:p>
+        </w:tc>
+      </w:tr>
+      <w:tr>
+        <w:tc>
+          <w:tcPr>
+            <w:tcW w:type="dxa" w:w="2200"/>
+          </w:tcPr>
+          <w:p>
+            <w:r>
+              <w:rPr>
+                <w:rFonts w:ascii="Consolas" w:cs="Consolas" w:eastAsia="Consolas" w:hAnsi="Consolas"/>
+              </w:rPr>
+              <w:t xml:space="preserve">Result indicator</w:t>
+            </w:r>
+          </w:p>
+        </w:tc>
+        <w:tc>
+          <w:tcPr>
+            <w:tcW w:type="dxa" w:w="7800"/>
+          </w:tcPr>
+          <w:p>
+            <w:r>
+              <w:t xml:space="preserve">Rendered with the existing Badge component, following the same green/red convention already used for status and risk badges elsewhere in the dashboard.</w:t>
+            </w:r>
+          </w:p>
+        </w:tc>
+      </w:tr>
+      <w:tr>
+        <w:tc>
+          <w:tcPr>
+            <w:tcW w:type="dxa" w:w="2200"/>
+          </w:tcPr>
+          <w:p>
+            <w:r>
+              <w:rPr>
+                <w:rFonts w:ascii="Consolas" w:cs="Consolas" w:eastAsia="Consolas" w:hAnsi="Consolas"/>
+              </w:rPr>
+              <w:t xml:space="preserve">Pagination</w:t>
+            </w:r>
+          </w:p>
+        </w:tc>
+        <w:tc>
+          <w:tcPr>
+            <w:tcW w:type="dxa" w:w="7800"/>
+          </w:tcPr>
+          <w:p>
+            <w:r>
+              <w:t xml:space="preserve">Server-side pagination (or cursor/infinite scroll) over audit_log — it is append-only and grows continuously, so the view never loads the full table at once.</w:t>
+            </w:r>
+          </w:p>
+        </w:tc>
+      </w:tr>
+      <w:tr>
+        <w:tc>
+          <w:tcPr>
+            <w:tcW w:type="dxa" w:w="2200"/>
+          </w:tcPr>
+          <w:p>
+            <w:r>
+              <w:rPr>
+                <w:rFonts w:ascii="Consolas" w:cs="Consolas" w:eastAsia="Consolas" w:hAnsi="Consolas"/>
+              </w:rPr>
+              <w:t xml:space="preserve">Export</w:t>
+            </w:r>
+          </w:p>
+        </w:tc>
+        <w:tc>
+          <w:tcPr>
+            <w:tcW w:type="dxa" w:w="7800"/>
+          </w:tcPr>
+          <w:p>
+            <w:r>
+              <w:t xml:space="preserve">An “Export CSV” action that streams the currently filtered result set — not just the visible page — for handing to a compliance reviewer.</w:t>
+            </w:r>
+          </w:p>
+        </w:tc>
+      </w:tr>
+      <w:tr>
+        <w:tc>
+          <w:tcPr>
+            <w:tcW w:type="dxa" w:w="2200"/>
+          </w:tcPr>
+          <w:p>
+            <w:r>
+              <w:rPr>
+                <w:rFonts w:ascii="Consolas" w:cs="Consolas" w:eastAsia="Consolas" w:hAnsi="Consolas"/>
+              </w:rPr>
+              <w:t xml:space="preserve">Editability</w:t>
+            </w:r>
+          </w:p>
+        </w:tc>
+        <w:tc>
+          <w:tcPr>
+            <w:tcW w:type="dxa" w:w="7800"/>
+          </w:tcPr>
+          <w:p>
+            <w:r>
+              <w:t xml:space="preserve">Strictly read-only: no edit or delete affordance anywhere in this view, matching audit_log having no update/delete path at the API layer.</w:t>
+            </w:r>
+          </w:p>
+        </w:tc>
+      </w:tr>
+    </w:tbl>
+    <w:p>
+      <w:pPr>
+        <w:pStyle w:val="Heading2"/>
+        <w:spacing w:after="120" w:before="240"/>
+      </w:pPr>
+      <w:r>
+        <w:t xml:space="preserve">7.3 User &amp; Role Management (permission control)</w:t>
+      </w:r>
+    </w:p>
+    <w:tbl>
+      <w:tblPr>
+        <w:tblW w:type="dxa" w:w="10000"/>
+        <w:tblBorders>
+          <w:top w:val="single" w:color="auto" w:sz="4"/>
+          <w:left w:val="single" w:color="auto" w:sz="4"/>
+          <w:bottom w:val="single" w:color="auto" w:sz="4"/>
+          <w:right w:val="single" w:color="auto" w:sz="4"/>
+          <w:insideH w:val="single" w:color="auto" w:sz="4"/>
+          <w:insideV w:val="single" w:color="auto" w:sz="4"/>
+        </w:tblBorders>
+      </w:tblPr>
+      <w:tblGrid>
+        <w:gridCol w:w="2200"/>
+        <w:gridCol w:w="7800"/>
+      </w:tblGrid>
+      <w:tr>
+        <w:trPr>
+          <w:tblHeader/>
+        </w:trPr>
+        <w:tc>
+          <w:tcPr>
+            <w:tcW w:type="dxa" w:w="2200"/>
+            <w:shd w:fill="1A2332" w:val="clear"/>
+          </w:tcPr>
+          <w:p>
+            <w:r>
+              <w:rPr>
+                <w:b/>
+                <w:bCs/>
+                <w:color w:val="FFFFFF"/>
+              </w:rPr>
+              <w:t xml:space="preserve">Element</w:t>
+            </w:r>
+          </w:p>
+        </w:tc>
+        <w:tc>
+          <w:tcPr>
+            <w:tcW w:type="dxa" w:w="7800"/>
+            <w:shd w:fill="1A2332" w:val="clear"/>
+          </w:tcPr>
+          <w:p>
+            <w:r>
+              <w:rPr>
+                <w:b/>
+                <w:bCs/>
+                <w:color w:val="FFFFFF"/>
+              </w:rPr>
+              <w:t xml:space="preserve">Behavior</w:t>
+            </w:r>
+          </w:p>
+        </w:tc>
+      </w:tr>
+      <w:tr>
+        <w:tc>
+          <w:tcPr>
+            <w:tcW w:type="dxa" w:w="2200"/>
+          </w:tcPr>
+          <w:p>
+            <w:r>
+              <w:rPr>
+                <w:rFonts w:ascii="Consolas" w:cs="Consolas" w:eastAsia="Consolas" w:hAnsi="Consolas"/>
+              </w:rPr>
+              <w:t xml:space="preserve">Users table</w:t>
+            </w:r>
+          </w:p>
+        </w:tc>
+        <w:tc>
+          <w:tcPr>
+            <w:tcW w:type="dxa" w:w="7800"/>
+          </w:tcPr>
+          <w:p>
+            <w:r>
+              <w:t xml:space="preserve">Name/email, role (admin/user), auth provider (SSO or local), status (active/disabled), last login.</w:t>
+            </w:r>
+          </w:p>
+        </w:tc>
+      </w:tr>
+      <w:tr>
+        <w:tc>
+          <w:tcPr>
+            <w:tcW w:type="dxa" w:w="2200"/>
+          </w:tcPr>
+          <w:p>
+            <w:r>
+              <w:rPr>
+                <w:rFonts w:ascii="Consolas" w:cs="Consolas" w:eastAsia="Consolas" w:hAnsi="Consolas"/>
+              </w:rPr>
+              <w:t xml:space="preserve">Create/invite</w:t>
+            </w:r>
+          </w:p>
+        </w:tc>
+        <w:tc>
+          <w:tcPr>
+            <w:tcW w:type="dxa" w:w="7800"/>
+          </w:tcPr>
+          <w:p>
+            <w:r>
+              <w:t xml:space="preserve">Admin-only action to create a local account — restricted to the admin/break-glass path from Section 4, not general self-registration.</w:t>
+            </w:r>
+          </w:p>
+        </w:tc>
+      </w:tr>
+      <w:tr>
+        <w:tc>
+          <w:tcPr>
+            <w:tcW w:type="dxa" w:w="2200"/>
+          </w:tcPr>
+          <w:p>
+            <w:r>
+              <w:rPr>
+                <w:rFonts w:ascii="Consolas" w:cs="Consolas" w:eastAsia="Consolas" w:hAnsi="Consolas"/>
+              </w:rPr>
+              <w:t xml:space="preserve">Role change</w:t>
+            </w:r>
+          </w:p>
+        </w:tc>
+        <w:tc>
+          <w:tcPr>
+            <w:tcW w:type="dxa" w:w="7800"/>
+          </w:tcPr>
+          <w:p>
+            <w:r>
+              <w:t xml:space="preserve">Admin can change a user's role; because granting admin has a large blast radius, this action requires an explicit confirmation step (e.g. a modal) before it takes effect.</w:t>
+            </w:r>
+          </w:p>
+        </w:tc>
+      </w:tr>
+      <w:tr>
+        <w:tc>
+          <w:tcPr>
+            <w:tcW w:type="dxa" w:w="2200"/>
+          </w:tcPr>
+          <w:p>
+            <w:r>
+              <w:rPr>
+                <w:rFonts w:ascii="Consolas" w:cs="Consolas" w:eastAsia="Consolas" w:hAnsi="Consolas"/>
+              </w:rPr>
+              <w:t xml:space="preserve">Disable/enable</w:t>
+            </w:r>
+          </w:p>
+        </w:tc>
+        <w:tc>
+          <w:tcPr>
+            <w:tcW w:type="dxa" w:w="7800"/>
+          </w:tcPr>
+          <w:p>
+            <w:r>
+              <w:t xml:space="preserve">Admin can disable an account (blocking sign-in immediately, local or SSO) without deleting its history.</w:t>
+            </w:r>
+          </w:p>
+        </w:tc>
+      </w:tr>
+      <w:tr>
+        <w:tc>
+          <w:tcPr>
+            <w:tcW w:type="dxa" w:w="2200"/>
+          </w:tcPr>
+          <w:p>
+            <w:r>
+              <w:rPr>
+                <w:rFonts w:ascii="Consolas" w:cs="Consolas" w:eastAsia="Consolas" w:hAnsi="Consolas"/>
+              </w:rPr>
+              <w:t xml:space="preserve">Local password reset</w:t>
+            </w:r>
+          </w:p>
+        </w:tc>
+        <w:tc>
+          <w:tcPr>
+            <w:tcW w:type="dxa" w:w="7800"/>
+          </w:tcPr>
+          <w:p>
+            <w:r>
+              <w:t xml:space="preserve">Admin-triggered reset for local accounts only; SSO-authenticated users manage credentials through the IdP, not here.</w:t>
+            </w:r>
+          </w:p>
+        </w:tc>
+      </w:tr>
+      <w:tr>
+        <w:tc>
+          <w:tcPr>
+            <w:tcW w:type="dxa" w:w="2200"/>
+          </w:tcPr>
+          <w:p>
+            <w:r>
+              <w:rPr>
+                <w:rFonts w:ascii="Consolas" w:cs="Consolas" w:eastAsia="Consolas" w:hAnsi="Consolas"/>
+              </w:rPr>
+              <w:t xml:space="preserve">SSO-owned fields</w:t>
+            </w:r>
+          </w:p>
+        </w:tc>
+        <w:tc>
+          <w:tcPr>
+            <w:tcW w:type="dxa" w:w="7800"/>
+          </w:tcPr>
+          <w:p>
+            <w:r>
+              <w:t xml:space="preserve">For SSO-provisioned users, identity fields (email, SSO subject id) are shown read-only — they're owned by the identity provider, not editable in this console.</w:t>
+            </w:r>
+          </w:p>
+        </w:tc>
+      </w:tr>
+    </w:tbl>
+    <w:p>
+      <w:pPr>
+        <w:pStyle w:val="Heading2"/>
+        <w:spacing w:after="120" w:before="240"/>
+      </w:pPr>
+      <w:r>
+        <w:t xml:space="preserve">7.4 Audit coupling</w:t>
+      </w:r>
+    </w:p>
+    <w:p>
+      <w:pPr>
+        <w:spacing w:after="120"/>
+      </w:pPr>
+      <w:r>
+        <w:t xml:space="preserve">Every action available in this console — role changes, account creation, disable/enable, password resets — writes an audit_log entry per the “Account admin” event category in Section 6.1. The GUI does not introduce any capability that bypasses the audit trail; it is a view and control surface over the same tables and event log described in Sections 5 and 6.</w:t>
       </w:r>
     </w:p>
     <w:p>
@@ -1118,7 +1582,63 @@
         <w:spacing w:after="160" w:before="320"/>
       </w:pPr>
       <w:r>
-        <w:t xml:space="preserve">8. Migration &amp; Rollout Plan</w:t>
+        <w:t xml:space="preserve">8. Data Model Impact</w:t>
+      </w:r>
+    </w:p>
+    <w:p>
+      <w:pPr>
+        <w:spacing w:after="120"/>
+      </w:pPr>
+      <w:r>
+        <w:t xml:space="preserve">New tables required — there are no user, session, or audit tables in the schema today:</w:t>
+      </w:r>
+    </w:p>
+    <w:p>
+      <w:pPr>
+        <w:pStyle w:val="ListParagraph"/>
+        <w:numPr>
+          <w:ilvl w:val="0"/>
+          <w:numId w:val="1"/>
+        </w:numPr>
+        <w:spacing w:after="80"/>
+      </w:pPr>
+      <w:r>
+        <w:t xml:space="preserve">users — id, email, display_name, role, auth_provider (local | sso), password_hash (nullable), sso_subject_id (nullable), is_active, created_at, last_login_at.</w:t>
+      </w:r>
+    </w:p>
+    <w:p>
+      <w:pPr>
+        <w:pStyle w:val="ListParagraph"/>
+        <w:numPr>
+          <w:ilvl w:val="0"/>
+          <w:numId w:val="1"/>
+        </w:numPr>
+        <w:spacing w:after="80"/>
+      </w:pPr>
+      <w:r>
+        <w:t xml:space="preserve">audit_log — as described in 6.2, indexed by timestamp and actor_user_id.</w:t>
+      </w:r>
+    </w:p>
+    <w:p>
+      <w:pPr>
+        <w:pStyle w:val="ListParagraph"/>
+        <w:numPr>
+          <w:ilvl w:val="0"/>
+          <w:numId w:val="1"/>
+        </w:numPr>
+        <w:spacing w:after="80"/>
+      </w:pPr>
+      <w:r>
+        <w:t xml:space="preserve">Sessions are managed by the auth library's own store (e.g. NextAuth's session table/JWT), not a new bespoke table.</w:t>
+      </w:r>
+    </w:p>
+    <w:p>
+      <w:pPr>
+        <w:pStyle w:val="Heading1"/>
+        <w:spacing w:after="160" w:before="320"/>
+      </w:pPr>
+      <w:r>
+        <w:t xml:space="preserve">9. Migration &amp; Rollout Plan</w:t>
       </w:r>
     </w:p>
     <w:tbl>
@@ -1259,7 +1779,7 @@
               <w:rPr>
                 <w:rFonts w:ascii="Consolas" w:cs="Consolas" w:eastAsia="Consolas" w:hAnsi="Consolas"/>
               </w:rPr>
-              <w:t xml:space="preserve">4. Audit coverage</w:t>
+              <w:t xml:space="preserve">4. Audit coverage + admin console</w:t>
             </w:r>
           </w:p>
         </w:tc>
@@ -1269,7 +1789,7 @@
           </w:tcPr>
           <w:p>
             <w:r>
-              <w:t xml:space="preserve">Instrument data-changing actions and auth events per Section 6; ship the admin-only audit log view and CSV export.</w:t>
+              <w:t xml:space="preserve">Instrument data-changing actions and auth events per Section 6; ship the admin console GUI from Section 7 — audit log viewer with CSV export, plus user and role management.</w:t>
             </w:r>
           </w:p>
         </w:tc>
@@ -1306,7 +1826,7 @@
         <w:spacing w:after="160" w:before="320"/>
       </w:pPr>
       <w:r>
-        <w:t xml:space="preserve">9. Security Considerations</w:t>
+        <w:t xml:space="preserve">10. Security Considerations</w:t>
       </w:r>
     </w:p>
     <w:p>
@@ -1380,7 +1900,7 @@
         <w:spacing w:after="160" w:before="320"/>
       </w:pPr>
       <w:r>
-        <w:t xml:space="preserve">10. Open Items Before Building</w:t>
+        <w:t xml:space="preserve">11. Open Items Before Building</w:t>
       </w:r>
     </w:p>
     <w:p>

</xml_diff>